<commit_message>
Behaviours: GUDD (Good Uniform Dress Down) uniform-infraction tracking
A behaviour can be flagged 'uniform': logging it counts as a normal strike AND
toward losing the GUDD. GUDD has its own config (Setup, admin-only): enable,
threshold (default 3), a SEPARATE fade window (default 30 days), and an
escalation ladder applied after the loss (each further infraction -> next
consequence, holding at the last).

- Models: Behavior.uniform, BehaviorIncident.behaviorSnapshot.uniform, BehaviorConfig.gudd
- Logging snapshots uniform; guddStatus() helper computes count/lost/atRisk/consequence
- Surfaced (always-visible chip, green/amber/red) on the teacher log view and the
  student page; School Insights lists who's lost it or at risk + next consequence
- Setup: GUDD block; Behaviours editor: per-behaviour 'uniform infraction' checkbox + GUDD badge
- Guide + teacher/admin invite emails describe the feature

Co-Authored-By: Claude Opus 4.8 <noreply@anthropic.com>
</commit_message>
<xml_diff>
--- a/frontend/src/app/behavior/House-System-Proposal-Detailed.docx
+++ b/frontend/src/app/behavior/House-System-Proposal-Detailed.docx
@@ -2393,6 +2393,109 @@
     </w:p>
     <w:p>
       <w:pPr>
+        <w:spacing w:after="120"/>
+      </w:pPr>
+      <w:r>
+        <w:rPr>
+          <w:b/>
+          <w:bCs/>
+        </w:rPr>
+        <w:t xml:space="preserve">Fairness to the individual within the team.</w:t>
+      </w:r>
+      <w:r>
+        <w:t xml:space="preserve"> A reasonable concern: in a pure team-total system, a well-behaved student could miss the reward because of poorly-behaved housemates, while a poorly-behaved student could ride a winning house to the prize. Two safeguards address both halves:</w:t>
+      </w:r>
+    </w:p>
+    <w:p>
+      <w:pPr>
+        <w:pStyle w:val="ListParagraph"/>
+        <w:numPr>
+          <w:ilvl w:val="0"/>
+          <w:numId w:val="2"/>
+        </w:numPr>
+        <w:spacing w:after="60"/>
+      </w:pPr>
+      <w:r>
+        <w:rPr>
+          <w:b/>
+          <w:bCs/>
+        </w:rPr>
+        <w:t xml:space="preserve">Extreme behavioural outliers are excluded from the house tally</w:t>
+      </w:r>
+      <w:r>
+        <w:t xml:space="preserve"> (high </w:t>
+      </w:r>
+      <w:r>
+        <w:rPr>
+          <w:i/>
+          <w:iCs/>
+        </w:rPr>
+        <w:t xml:space="preserve">or</w:t>
+      </w:r>
+      <w:r>
+        <w:t xml:space="preserve"> low). A handful of students can't single-handedly sink or inflate a house, so the score reflects the broad group's real effort and the well-behaved majority isn't dragged down by a couple of teammates.</w:t>
+      </w:r>
+    </w:p>
+    <w:p>
+      <w:pPr>
+        <w:pStyle w:val="ListParagraph"/>
+        <w:numPr>
+          <w:ilvl w:val="0"/>
+          <w:numId w:val="2"/>
+        </w:numPr>
+        <w:spacing w:after="60"/>
+      </w:pPr>
+      <w:r>
+        <w:rPr>
+          <w:b/>
+          <w:bCs/>
+        </w:rPr>
+        <w:t xml:space="preserve">The end-of-year prize carries a transparent, pre-published eligibility floor</w:t>
+      </w:r>
+      <w:r>
+        <w:t xml:space="preserve"> (e.g., no major incidents in the final term, under a set number of strikes). The trip is </w:t>
+      </w:r>
+      <w:r>
+        <w:rPr>
+          <w:i/>
+          <w:iCs/>
+        </w:rPr>
+        <w:t xml:space="preserve">earned by individual conduct</w:t>
+      </w:r>
+      <w:r>
+        <w:t xml:space="preserve">, not simply inherited by being on the winning house — and because the criteria are objective and known in advance, it's defensible to students and parents and avoids any subjective, named “exclusion list.”</w:t>
+      </w:r>
+    </w:p>
+    <w:p>
+      <w:pPr>
+        <w:spacing w:after="120"/>
+      </w:pPr>
+      <w:r>
+        <w:t xml:space="preserve">Net effect: the </w:t>
+      </w:r>
+      <w:r>
+        <w:rPr>
+          <w:b/>
+          <w:bCs/>
+        </w:rPr>
+        <w:t xml:space="preserve">House Cup standings stay genuinely team-based</w:t>
+      </w:r>
+      <w:r>
+        <w:t xml:space="preserve">, while the </w:t>
+      </w:r>
+      <w:r>
+        <w:rPr>
+          <w:b/>
+          <w:bCs/>
+        </w:rPr>
+        <w:t xml:space="preserve">big reward has a clear individual floor</w:t>
+      </w:r>
+      <w:r>
+        <w:t xml:space="preserve"> everyone knows up front.</w:t>
+      </w:r>
+    </w:p>
+    <w:p>
+      <w:pPr>
         <w:pBdr>
           <w:bottom w:val="single" w:color="2E75B6" w:sz="6" w:space="1"/>
         </w:pBdr>
@@ -3693,6 +3796,56 @@
           <w:p>
             <w:r>
               <w:t xml:space="preserve">Deductions are never named publicly; a collective streak bonus rewards the whole house; repeat issues handled 1:1 by heads of house.</w:t>
+            </w:r>
+          </w:p>
+        </w:tc>
+      </w:tr>
+      <w:tr>
+        <w:tc>
+          <w:tcPr>
+            <w:tcW w:type="dxa" w:w="2900"/>
+            <w:tcBorders>
+              <w:top w:val="single" w:color="CCCCCC" w:sz="1"/>
+              <w:left w:val="single" w:color="CCCCCC" w:sz="1"/>
+              <w:bottom w:val="single" w:color="CCCCCC" w:sz="1"/>
+              <w:right w:val="single" w:color="CCCCCC" w:sz="1"/>
+            </w:tcBorders>
+            <w:tcMar>
+              <w:top w:type="dxa" w:w="80"/>
+              <w:left w:type="dxa" w:w="120"/>
+              <w:bottom w:type="dxa" w:w="80"/>
+              <w:right w:type="dxa" w:w="120"/>
+            </w:tcMar>
+          </w:tcPr>
+          <w:p>
+            <w:r>
+              <w:rPr>
+                <w:b/>
+                <w:bCs/>
+              </w:rPr>
+              <w:t xml:space="preserve">Good students penalized / free-riding</w:t>
+            </w:r>
+          </w:p>
+        </w:tc>
+        <w:tc>
+          <w:tcPr>
+            <w:tcW w:type="dxa" w:w="6460"/>
+            <w:tcBorders>
+              <w:top w:val="single" w:color="CCCCCC" w:sz="1"/>
+              <w:left w:val="single" w:color="CCCCCC" w:sz="1"/>
+              <w:bottom w:val="single" w:color="CCCCCC" w:sz="1"/>
+              <w:right w:val="single" w:color="CCCCCC" w:sz="1"/>
+            </w:tcBorders>
+            <w:tcMar>
+              <w:top w:type="dxa" w:w="80"/>
+              <w:left w:type="dxa" w:w="120"/>
+              <w:bottom w:type="dxa" w:w="80"/>
+              <w:right w:type="dxa" w:w="120"/>
+            </w:tcMar>
+          </w:tcPr>
+          <w:p>
+            <w:r>
+              <w:t xml:space="preserve">Extreme outliers are excluded from the house tally; the prize has a transparent, pre-published individual eligibility floor — so the reward is earned by conduct, not inherited.</w:t>
             </w:r>
           </w:p>
         </w:tc>

</xml_diff>

<commit_message>
Houses committee: non-admins who can manage Houses without full Setup access
- BehaviorTeacher.housesCommittee + canManageHouses middleware (admin OR committee)
- House routes (CRUD, backfill, split-groups, portal-code, report) now canManageHouses
- New PUT /houses/config (caps/events/enable/report/reset) + PUT /houses/captain — committee-allowed
- PUT /team/houses-committee toggle; /team + /me expose the flag
- Setup shows the full Houses section to committee members; Team page gains a 'Houses cmte' checkbox

Co-Authored-By: Claude Opus 4.8 <noreply@anthropic.com>
</commit_message>
<xml_diff>
--- a/frontend/src/app/behavior/House-System-Proposal-Detailed.docx
+++ b/frontend/src/app/behavior/House-System-Proposal-Detailed.docx
@@ -2648,7 +2648,7 @@
         <w:t xml:space="preserve">Live leaderboard.</w:t>
       </w:r>
       <w:r>
-        <w:t xml:space="preserve"> The dashboard shows current standings with totals and student counts, visible to all staff.</w:t>
+        <w:t xml:space="preserve"> The dashboard shows current standings with totals and student counts, visible to all staff and students (e.g., on the hallway screen).</w:t>
       </w:r>
     </w:p>
     <w:p>
@@ -3478,32 +3478,404 @@
           <w:b/>
           <w:bCs/>
         </w:rPr>
-        <w:t xml:space="preserve">Add-ons to consider</w:t>
-      </w:r>
-      <w:r>
-        <w:t xml:space="preserve"> (any tier): small monthly incentives for the leading house — free-dress, a treat, extra break — at roughly </w:t>
-      </w:r>
-      <w:r>
-        <w:rPr>
-          <w:b/>
-          <w:bCs/>
-        </w:rPr>
-        <w:t xml:space="preserve">$300–500</w:t>
-      </w:r>
-      <w:r>
-        <w:t xml:space="preserve"> for the year, plus a one-time </w:t>
-      </w:r>
-      <w:r>
-        <w:rPr>
-          <w:b/>
-          <w:bCs/>
-        </w:rPr>
-        <w:t xml:space="preserve">$300–600</w:t>
-      </w:r>
-      <w:r>
-        <w:t xml:space="preserve"> for banners, colours, and crest printing at launch.</w:t>
-      </w:r>
-    </w:p>
+        <w:t xml:space="preserve">Beyond the prize — a one-time startup &amp; materials budget:</w:t>
+      </w:r>
+    </w:p>
+    <w:tbl>
+      <w:tblPr>
+        <w:tblW w:type="dxa" w:w="9360"/>
+        <w:tblBorders>
+          <w:top w:val="single" w:color="auto" w:sz="4"/>
+          <w:left w:val="single" w:color="auto" w:sz="4"/>
+          <w:bottom w:val="single" w:color="auto" w:sz="4"/>
+          <w:right w:val="single" w:color="auto" w:sz="4"/>
+          <w:insideH w:val="single" w:color="auto" w:sz="4"/>
+          <w:insideV w:val="single" w:color="auto" w:sz="4"/>
+        </w:tblBorders>
+      </w:tblPr>
+      <w:tblGrid>
+        <w:gridCol w:w="2300"/>
+        <w:gridCol w:w="5060"/>
+        <w:gridCol w:w="2000"/>
+      </w:tblGrid>
+      <w:tr>
+        <w:trPr>
+          <w:tblHeader/>
+        </w:trPr>
+        <w:tc>
+          <w:tcPr>
+            <w:tcW w:type="dxa" w:w="2300"/>
+            <w:tcBorders>
+              <w:top w:val="single" w:color="CCCCCC" w:sz="1"/>
+              <w:left w:val="single" w:color="CCCCCC" w:sz="1"/>
+              <w:bottom w:val="single" w:color="CCCCCC" w:sz="1"/>
+              <w:right w:val="single" w:color="CCCCCC" w:sz="1"/>
+            </w:tcBorders>
+            <w:shd w:fill="2E75B6" w:val="clear"/>
+            <w:tcMar>
+              <w:top w:type="dxa" w:w="80"/>
+              <w:left w:type="dxa" w:w="120"/>
+              <w:bottom w:type="dxa" w:w="80"/>
+              <w:right w:type="dxa" w:w="120"/>
+            </w:tcMar>
+          </w:tcPr>
+          <w:p>
+            <w:r>
+              <w:rPr>
+                <w:b/>
+                <w:bCs/>
+                <w:color w:val="FFFFFF"/>
+              </w:rPr>
+              <w:t xml:space="preserve">Item</w:t>
+            </w:r>
+          </w:p>
+        </w:tc>
+        <w:tc>
+          <w:tcPr>
+            <w:tcW w:type="dxa" w:w="5060"/>
+            <w:tcBorders>
+              <w:top w:val="single" w:color="CCCCCC" w:sz="1"/>
+              <w:left w:val="single" w:color="CCCCCC" w:sz="1"/>
+              <w:bottom w:val="single" w:color="CCCCCC" w:sz="1"/>
+              <w:right w:val="single" w:color="CCCCCC" w:sz="1"/>
+            </w:tcBorders>
+            <w:shd w:fill="2E75B6" w:val="clear"/>
+            <w:tcMar>
+              <w:top w:type="dxa" w:w="80"/>
+              <w:left w:type="dxa" w:w="120"/>
+              <w:bottom w:type="dxa" w:w="80"/>
+              <w:right w:type="dxa" w:w="120"/>
+            </w:tcMar>
+          </w:tcPr>
+          <w:p>
+            <w:r>
+              <w:rPr>
+                <w:b/>
+                <w:bCs/>
+                <w:color w:val="FFFFFF"/>
+              </w:rPr>
+              <w:t xml:space="preserve">Notes</w:t>
+            </w:r>
+          </w:p>
+        </w:tc>
+        <w:tc>
+          <w:tcPr>
+            <w:tcW w:type="dxa" w:w="2000"/>
+            <w:tcBorders>
+              <w:top w:val="single" w:color="CCCCCC" w:sz="1"/>
+              <w:left w:val="single" w:color="CCCCCC" w:sz="1"/>
+              <w:bottom w:val="single" w:color="CCCCCC" w:sz="1"/>
+              <w:right w:val="single" w:color="CCCCCC" w:sz="1"/>
+            </w:tcBorders>
+            <w:shd w:fill="2E75B6" w:val="clear"/>
+            <w:tcMar>
+              <w:top w:type="dxa" w:w="80"/>
+              <w:left w:type="dxa" w:w="120"/>
+              <w:bottom w:type="dxa" w:w="80"/>
+              <w:right w:type="dxa" w:w="120"/>
+            </w:tcMar>
+          </w:tcPr>
+          <w:p>
+            <w:r>
+              <w:rPr>
+                <w:b/>
+                <w:bCs/>
+                <w:color w:val="FFFFFF"/>
+              </w:rPr>
+              <w:t xml:space="preserve">Est. cost</w:t>
+            </w:r>
+          </w:p>
+        </w:tc>
+      </w:tr>
+      <w:tr>
+        <w:tc>
+          <w:tcPr>
+            <w:tcW w:type="dxa" w:w="2300"/>
+            <w:tcBorders>
+              <w:top w:val="single" w:color="CCCCCC" w:sz="1"/>
+              <w:left w:val="single" w:color="CCCCCC" w:sz="1"/>
+              <w:bottom w:val="single" w:color="CCCCCC" w:sz="1"/>
+              <w:right w:val="single" w:color="CCCCCC" w:sz="1"/>
+            </w:tcBorders>
+            <w:tcMar>
+              <w:top w:type="dxa" w:w="80"/>
+              <w:left w:type="dxa" w:w="120"/>
+              <w:bottom w:type="dxa" w:w="80"/>
+              <w:right w:type="dxa" w:w="120"/>
+            </w:tcMar>
+          </w:tcPr>
+          <w:p>
+            <w:r>
+              <w:rPr>
+                <w:b/>
+                <w:bCs/>
+              </w:rPr>
+              <w:t xml:space="preserve">House t-shirts</w:t>
+            </w:r>
+          </w:p>
+        </w:tc>
+        <w:tc>
+          <w:tcPr>
+            <w:tcW w:type="dxa" w:w="5060"/>
+            <w:tcBorders>
+              <w:top w:val="single" w:color="CCCCCC" w:sz="1"/>
+              <w:left w:val="single" w:color="CCCCCC" w:sz="1"/>
+              <w:bottom w:val="single" w:color="CCCCCC" w:sz="1"/>
+              <w:right w:val="single" w:color="CCCCCC" w:sz="1"/>
+            </w:tcBorders>
+            <w:tcMar>
+              <w:top w:type="dxa" w:w="80"/>
+              <w:left w:type="dxa" w:w="120"/>
+              <w:bottom w:type="dxa" w:w="80"/>
+              <w:right w:type="dxa" w:w="120"/>
+            </w:tcMar>
+          </w:tcPr>
+          <w:p>
+            <w:r>
+              <w:t xml:space="preserve">One per student in house colours (~180 × $10); budget a little extra for spares &amp; new arrivals</w:t>
+            </w:r>
+          </w:p>
+        </w:tc>
+        <w:tc>
+          <w:tcPr>
+            <w:tcW w:type="dxa" w:w="2000"/>
+            <w:tcBorders>
+              <w:top w:val="single" w:color="CCCCCC" w:sz="1"/>
+              <w:left w:val="single" w:color="CCCCCC" w:sz="1"/>
+              <w:bottom w:val="single" w:color="CCCCCC" w:sz="1"/>
+              <w:right w:val="single" w:color="CCCCCC" w:sz="1"/>
+            </w:tcBorders>
+            <w:tcMar>
+              <w:top w:type="dxa" w:w="80"/>
+              <w:left w:type="dxa" w:w="120"/>
+              <w:bottom w:type="dxa" w:w="80"/>
+              <w:right w:type="dxa" w:w="120"/>
+            </w:tcMar>
+          </w:tcPr>
+          <w:p>
+            <w:r>
+              <w:t xml:space="preserve">$1,800–2,000</w:t>
+            </w:r>
+          </w:p>
+        </w:tc>
+      </w:tr>
+      <w:tr>
+        <w:tc>
+          <w:tcPr>
+            <w:tcW w:type="dxa" w:w="2300"/>
+            <w:tcBorders>
+              <w:top w:val="single" w:color="CCCCCC" w:sz="1"/>
+              <w:left w:val="single" w:color="CCCCCC" w:sz="1"/>
+              <w:bottom w:val="single" w:color="CCCCCC" w:sz="1"/>
+              <w:right w:val="single" w:color="CCCCCC" w:sz="1"/>
+            </w:tcBorders>
+            <w:tcMar>
+              <w:top w:type="dxa" w:w="80"/>
+              <w:left w:type="dxa" w:w="120"/>
+              <w:bottom w:type="dxa" w:w="80"/>
+              <w:right w:type="dxa" w:w="120"/>
+            </w:tcMar>
+          </w:tcPr>
+          <w:p>
+            <w:r>
+              <w:rPr>
+                <w:b/>
+                <w:bCs/>
+              </w:rPr>
+              <w:t xml:space="preserve">Hallway display screen</w:t>
+            </w:r>
+          </w:p>
+        </w:tc>
+        <w:tc>
+          <w:tcPr>
+            <w:tcW w:type="dxa" w:w="5060"/>
+            <w:tcBorders>
+              <w:top w:val="single" w:color="CCCCCC" w:sz="1"/>
+              <w:left w:val="single" w:color="CCCCCC" w:sz="1"/>
+              <w:bottom w:val="single" w:color="CCCCCC" w:sz="1"/>
+              <w:right w:val="single" w:color="CCCCCC" w:sz="1"/>
+            </w:tcBorders>
+            <w:tcMar>
+              <w:top w:type="dxa" w:w="80"/>
+              <w:left w:type="dxa" w:w="120"/>
+              <w:bottom w:type="dxa" w:w="80"/>
+              <w:right w:type="dxa" w:w="120"/>
+            </w:tcMar>
+          </w:tcPr>
+          <w:p>
+            <w:r>
+              <w:t xml:space="preserve">TV + wall mount above the stairwell for live standings. Requires a power outlet and an internet/network drop at that location — confirm with facilities; may need an electrician and a cabling run</w:t>
+            </w:r>
+          </w:p>
+        </w:tc>
+        <w:tc>
+          <w:tcPr>
+            <w:tcW w:type="dxa" w:w="2000"/>
+            <w:tcBorders>
+              <w:top w:val="single" w:color="CCCCCC" w:sz="1"/>
+              <w:left w:val="single" w:color="CCCCCC" w:sz="1"/>
+              <w:bottom w:val="single" w:color="CCCCCC" w:sz="1"/>
+              <w:right w:val="single" w:color="CCCCCC" w:sz="1"/>
+            </w:tcBorders>
+            <w:tcMar>
+              <w:top w:type="dxa" w:w="80"/>
+              <w:left w:type="dxa" w:w="120"/>
+              <w:bottom w:type="dxa" w:w="80"/>
+              <w:right w:type="dxa" w:w="120"/>
+            </w:tcMar>
+          </w:tcPr>
+          <w:p>
+            <w:r>
+              <w:t xml:space="preserve">~$500</w:t>
+            </w:r>
+          </w:p>
+        </w:tc>
+      </w:tr>
+      <w:tr>
+        <w:tc>
+          <w:tcPr>
+            <w:tcW w:type="dxa" w:w="2300"/>
+            <w:tcBorders>
+              <w:top w:val="single" w:color="CCCCCC" w:sz="1"/>
+              <w:left w:val="single" w:color="CCCCCC" w:sz="1"/>
+              <w:bottom w:val="single" w:color="CCCCCC" w:sz="1"/>
+              <w:right w:val="single" w:color="CCCCCC" w:sz="1"/>
+            </w:tcBorders>
+            <w:tcMar>
+              <w:top w:type="dxa" w:w="80"/>
+              <w:left w:type="dxa" w:w="120"/>
+              <w:bottom w:type="dxa" w:w="80"/>
+              <w:right w:type="dxa" w:w="120"/>
+            </w:tcMar>
+          </w:tcPr>
+          <w:p>
+            <w:r>
+              <w:rPr>
+                <w:b/>
+                <w:bCs/>
+              </w:rPr>
+              <w:t xml:space="preserve">Banners, colours &amp; crest printing</w:t>
+            </w:r>
+          </w:p>
+        </w:tc>
+        <w:tc>
+          <w:tcPr>
+            <w:tcW w:type="dxa" w:w="5060"/>
+            <w:tcBorders>
+              <w:top w:val="single" w:color="CCCCCC" w:sz="1"/>
+              <w:left w:val="single" w:color="CCCCCC" w:sz="1"/>
+              <w:bottom w:val="single" w:color="CCCCCC" w:sz="1"/>
+              <w:right w:val="single" w:color="CCCCCC" w:sz="1"/>
+            </w:tcBorders>
+            <w:tcMar>
+              <w:top w:type="dxa" w:w="80"/>
+              <w:left w:type="dxa" w:w="120"/>
+              <w:bottom w:type="dxa" w:w="80"/>
+              <w:right w:type="dxa" w:w="120"/>
+            </w:tcMar>
+          </w:tcPr>
+          <w:p>
+            <w:r>
+              <w:t xml:space="preserve">House identity materials at launch</w:t>
+            </w:r>
+          </w:p>
+        </w:tc>
+        <w:tc>
+          <w:tcPr>
+            <w:tcW w:type="dxa" w:w="2000"/>
+            <w:tcBorders>
+              <w:top w:val="single" w:color="CCCCCC" w:sz="1"/>
+              <w:left w:val="single" w:color="CCCCCC" w:sz="1"/>
+              <w:bottom w:val="single" w:color="CCCCCC" w:sz="1"/>
+              <w:right w:val="single" w:color="CCCCCC" w:sz="1"/>
+            </w:tcBorders>
+            <w:tcMar>
+              <w:top w:type="dxa" w:w="80"/>
+              <w:left w:type="dxa" w:w="120"/>
+              <w:bottom w:type="dxa" w:w="80"/>
+              <w:right w:type="dxa" w:w="120"/>
+            </w:tcMar>
+          </w:tcPr>
+          <w:p>
+            <w:r>
+              <w:t xml:space="preserve">$300–600</w:t>
+            </w:r>
+          </w:p>
+        </w:tc>
+      </w:tr>
+      <w:tr>
+        <w:tc>
+          <w:tcPr>
+            <w:tcW w:type="dxa" w:w="2300"/>
+            <w:tcBorders>
+              <w:top w:val="single" w:color="CCCCCC" w:sz="1"/>
+              <w:left w:val="single" w:color="CCCCCC" w:sz="1"/>
+              <w:bottom w:val="single" w:color="CCCCCC" w:sz="1"/>
+              <w:right w:val="single" w:color="CCCCCC" w:sz="1"/>
+            </w:tcBorders>
+            <w:tcMar>
+              <w:top w:type="dxa" w:w="80"/>
+              <w:left w:type="dxa" w:w="120"/>
+              <w:bottom w:type="dxa" w:w="80"/>
+              <w:right w:type="dxa" w:w="120"/>
+            </w:tcMar>
+          </w:tcPr>
+          <w:p>
+            <w:r>
+              <w:rPr>
+                <w:b/>
+                <w:bCs/>
+              </w:rPr>
+              <w:t xml:space="preserve">Monthly incentives (ongoing)</w:t>
+            </w:r>
+          </w:p>
+        </w:tc>
+        <w:tc>
+          <w:tcPr>
+            <w:tcW w:type="dxa" w:w="5060"/>
+            <w:tcBorders>
+              <w:top w:val="single" w:color="CCCCCC" w:sz="1"/>
+              <w:left w:val="single" w:color="CCCCCC" w:sz="1"/>
+              <w:bottom w:val="single" w:color="CCCCCC" w:sz="1"/>
+              <w:right w:val="single" w:color="CCCCCC" w:sz="1"/>
+            </w:tcBorders>
+            <w:tcMar>
+              <w:top w:type="dxa" w:w="80"/>
+              <w:left w:type="dxa" w:w="120"/>
+              <w:bottom w:type="dxa" w:w="80"/>
+              <w:right w:type="dxa" w:w="120"/>
+            </w:tcMar>
+          </w:tcPr>
+          <w:p>
+            <w:r>
+              <w:t xml:space="preserve">Small rewards for the leading house — free-dress, a treat, extra break — across the year</w:t>
+            </w:r>
+          </w:p>
+        </w:tc>
+        <w:tc>
+          <w:tcPr>
+            <w:tcW w:type="dxa" w:w="2000"/>
+            <w:tcBorders>
+              <w:top w:val="single" w:color="CCCCCC" w:sz="1"/>
+              <w:left w:val="single" w:color="CCCCCC" w:sz="1"/>
+              <w:bottom w:val="single" w:color="CCCCCC" w:sz="1"/>
+              <w:right w:val="single" w:color="CCCCCC" w:sz="1"/>
+            </w:tcBorders>
+            <w:tcMar>
+              <w:top w:type="dxa" w:w="80"/>
+              <w:left w:type="dxa" w:w="120"/>
+              <w:bottom w:type="dxa" w:w="80"/>
+              <w:right w:type="dxa" w:w="120"/>
+            </w:tcMar>
+          </w:tcPr>
+          <w:p>
+            <w:r>
+              <w:t xml:space="preserve">$300–500</w:t>
+            </w:r>
+          </w:p>
+        </w:tc>
+      </w:tr>
+    </w:tbl>
     <w:p>
       <w:pPr>
         <w:pBdr>
@@ -3945,7 +4317,57 @@
           </w:tcPr>
           <w:p>
             <w:r>
-              <w:t xml:space="preserve">Modest — the prize, small recognition budget, and house materials. The software is already in place.</w:t>
+              <w:t xml:space="preserve">Modest — the prize, t-shirts, hallway screen, small recognition budget, and house materials. The software is already in place.</w:t>
+            </w:r>
+          </w:p>
+        </w:tc>
+      </w:tr>
+      <w:tr>
+        <w:tc>
+          <w:tcPr>
+            <w:tcW w:type="dxa" w:w="2900"/>
+            <w:tcBorders>
+              <w:top w:val="single" w:color="CCCCCC" w:sz="1"/>
+              <w:left w:val="single" w:color="CCCCCC" w:sz="1"/>
+              <w:bottom w:val="single" w:color="CCCCCC" w:sz="1"/>
+              <w:right w:val="single" w:color="CCCCCC" w:sz="1"/>
+            </w:tcBorders>
+            <w:tcMar>
+              <w:top w:type="dxa" w:w="80"/>
+              <w:left w:type="dxa" w:w="120"/>
+              <w:bottom w:type="dxa" w:w="80"/>
+              <w:right w:type="dxa" w:w="120"/>
+            </w:tcMar>
+          </w:tcPr>
+          <w:p>
+            <w:r>
+              <w:rPr>
+                <w:b/>
+                <w:bCs/>
+              </w:rPr>
+              <w:t xml:space="preserve">Hallway screen logistics</w:t>
+            </w:r>
+          </w:p>
+        </w:tc>
+        <w:tc>
+          <w:tcPr>
+            <w:tcW w:type="dxa" w:w="6460"/>
+            <w:tcBorders>
+              <w:top w:val="single" w:color="CCCCCC" w:sz="1"/>
+              <w:left w:val="single" w:color="CCCCCC" w:sz="1"/>
+              <w:bottom w:val="single" w:color="CCCCCC" w:sz="1"/>
+              <w:right w:val="single" w:color="CCCCCC" w:sz="1"/>
+            </w:tcBorders>
+            <w:tcMar>
+              <w:top w:type="dxa" w:w="80"/>
+              <w:left w:type="dxa" w:w="120"/>
+              <w:bottom w:type="dxa" w:w="80"/>
+              <w:right w:type="dxa" w:w="120"/>
+            </w:tcMar>
+          </w:tcPr>
+          <w:p>
+            <w:r>
+              <w:t xml:space="preserve">The display location above the stairs needs a power outlet and internet — confirm with facilities before install; may require an electrician and a network drop.</w:t>
             </w:r>
           </w:p>
         </w:tc>

</xml_diff>